<commit_message>
Fix Table 1 caption, borders, cell text, and spacing after table
Companion-style caption (Table 1 + title centered). Double-spacing and
first-line indent restored on following body. Table borders and marker
cell text cleaned in Appendix tables.
</commit_message>
<xml_diff>
--- a/thesis/Thesis_Proposal_Instagram_MH_v10.docx
+++ b/thesis/Thesis_Proposal_Instagram_MH_v10.docx
@@ -1312,7 +1312,7 @@
     </w:p>
     <w:p>
       <w:pPr>
-        <w:spacing w:line="480" w:lineRule="auto"/>
+        <w:spacing w:line="480" w:lineRule="auto" w:before="0" w:after="0"/>
         <w:ind w:firstLine="720"/>
         <w:jc w:val="both"/>
         <w:rPr/>
@@ -1322,6 +1322,7 @@
       <w:r>
         <w:rPr>
           <w:rFonts w:ascii="Times New Roman" w:cs="Georgia" w:eastAsia="Georgia" w:hAnsi="Times New Roman"/>
+          <w:b w:val="0"/>
           <w:sz w:val="22"/>
           <w:szCs w:val="22"/>
           <w:rtl w:val="0"/>
@@ -1330,17 +1331,39 @@
       </w:r>
       <w:r>
         <w:rPr>
-          <w:rtl w:val="0"/>
-        </w:rPr>
-      </w:r>
-    </w:p>
-    <w:p>
-      <w:r>
-        <w:rPr>
           <w:rFonts w:ascii="Times New Roman" w:hAnsi="Times New Roman"/>
-          <w:sz w:val="22"/>
-        </w:rPr>
-        <w:t>Table 1. Discursive orientations for caption coding</w:t>
+          <w:b w:val="0"/>
+          <w:sz w:val="22"/>
+          <w:rtl w:val="0"/>
+        </w:rPr>
+      </w:r>
+    </w:p>
+    <w:p>
+      <w:pPr>
+        <w:spacing w:line="480" w:lineRule="auto" w:before="240" w:after="0"/>
+        <w:jc w:val="center"/>
+      </w:pPr>
+      <w:r>
+        <w:rPr>
+          <w:rFonts w:ascii="Times New Roman" w:hAnsi="Times New Roman"/>
+          <w:b/>
+          <w:sz w:val="22"/>
+        </w:rPr>
+        <w:t>Table 1</w:t>
+      </w:r>
+    </w:p>
+    <w:p>
+      <w:pPr>
+        <w:spacing w:line="480" w:lineRule="auto" w:before="0" w:after="120"/>
+        <w:jc w:val="center"/>
+      </w:pPr>
+      <w:r>
+        <w:rPr>
+          <w:rFonts w:ascii="Times New Roman" w:hAnsi="Times New Roman"/>
+          <w:b w:val="0"/>
+          <w:sz w:val="22"/>
+        </w:rPr>
+        <w:t>Discursive orientations for caption coding</w:t>
       </w:r>
     </w:p>
     <w:tbl>
@@ -1348,6 +1371,14 @@
         <w:tblW w:type="auto" w:w="0"/>
         <w:jc w:val="center"/>
         <w:tblLook w:firstColumn="1" w:firstRow="1" w:lastColumn="0" w:lastRow="0" w:noHBand="0" w:noVBand="1" w:val="04A0"/>
+        <w:tblBorders>
+          <w:top w:val="single" w:sz="4" w:space="0" w:color="000000"/>
+          <w:left w:val="single" w:sz="4" w:space="0" w:color="000000"/>
+          <w:bottom w:val="single" w:sz="4" w:space="0" w:color="000000"/>
+          <w:right w:val="single" w:sz="4" w:space="0" w:color="000000"/>
+          <w:insideH w:val="single" w:sz="4" w:space="0" w:color="000000"/>
+          <w:insideV w:val="single" w:sz="4" w:space="0" w:color="000000"/>
+        </w:tblBorders>
       </w:tblPr>
       <w:tblGrid>
         <w:gridCol w:w="2769"/>
@@ -1360,6 +1391,10 @@
             <w:tcW w:type="dxa" w:w="2769"/>
           </w:tcPr>
           <w:p>
+            <w:pPr>
+              <w:spacing w:before="40" w:after="40" w:line="276" w:lineRule="auto"/>
+              <w:jc w:val="center"/>
+            </w:pPr>
             <w:r>
               <w:rPr>
                 <w:rFonts w:ascii="Times New Roman" w:hAnsi="Times New Roman"/>
@@ -1374,6 +1409,10 @@
             <w:tcW w:type="dxa" w:w="2769"/>
           </w:tcPr>
           <w:p>
+            <w:pPr>
+              <w:spacing w:before="40" w:after="40" w:line="276" w:lineRule="auto"/>
+              <w:jc w:val="center"/>
+            </w:pPr>
             <w:r>
               <w:rPr>
                 <w:rFonts w:ascii="Times New Roman" w:hAnsi="Times New Roman"/>
@@ -1389,6 +1428,10 @@
             <w:tcW w:type="dxa" w:w="2769"/>
           </w:tcPr>
           <w:p>
+            <w:pPr>
+              <w:spacing w:before="40" w:after="40" w:line="276" w:lineRule="auto"/>
+              <w:jc w:val="center"/>
+            </w:pPr>
             <w:r>
               <w:rPr>
                 <w:rFonts w:ascii="Times New Roman" w:hAnsi="Times New Roman"/>
@@ -1406,6 +1449,9 @@
             <w:tcW w:type="dxa" w:w="2769"/>
           </w:tcPr>
           <w:p>
+            <w:pPr>
+              <w:spacing w:before="40" w:after="40" w:line="276" w:lineRule="auto"/>
+            </w:pPr>
             <w:r>
               <w:rPr>
                 <w:rFonts w:ascii="Times New Roman" w:hAnsi="Times New Roman"/>
@@ -1421,9 +1467,13 @@
             <w:tcW w:type="dxa" w:w="2769"/>
           </w:tcPr>
           <w:p>
+            <w:pPr>
+              <w:spacing w:before="40" w:after="40" w:line="276" w:lineRule="auto"/>
+            </w:pPr>
             <w:r>
               <w:rPr>
                 <w:rFonts w:ascii="Times New Roman" w:hAnsi="Times New Roman"/>
+                <w:b w:val="0"/>
                 <w:sz w:val="20"/>
               </w:rPr>
               <w:t>Future possibility or recovery trajectory</w:t>
@@ -1435,9 +1485,13 @@
             <w:tcW w:type="dxa" w:w="2769"/>
           </w:tcPr>
           <w:p>
+            <w:pPr>
+              <w:spacing w:before="40" w:after="40" w:line="276" w:lineRule="auto"/>
+            </w:pPr>
             <w:r>
               <w:rPr>
                 <w:rFonts w:ascii="Times New Roman" w:hAnsi="Times New Roman"/>
+                <w:b w:val="0"/>
                 <w:sz w:val="20"/>
               </w:rPr>
               <w:t>Present capacity to act or decide</w:t>
@@ -1451,6 +1505,9 @@
             <w:tcW w:type="dxa" w:w="2769"/>
           </w:tcPr>
           <w:p>
+            <w:pPr>
+              <w:spacing w:before="40" w:after="40" w:line="276" w:lineRule="auto"/>
+            </w:pPr>
             <w:r>
               <w:rPr>
                 <w:rFonts w:ascii="Times New Roman" w:hAnsi="Times New Roman"/>
@@ -1466,9 +1523,13 @@
             <w:tcW w:type="dxa" w:w="2769"/>
           </w:tcPr>
           <w:p>
+            <w:pPr>
+              <w:spacing w:before="40" w:after="40" w:line="276" w:lineRule="auto"/>
+            </w:pPr>
             <w:r>
               <w:rPr>
                 <w:rFonts w:ascii="Times New Roman" w:hAnsi="Times New Roman"/>
+                <w:b w:val="0"/>
                 <w:sz w:val="20"/>
               </w:rPr>
               <w:t>Someone who can look forward</w:t>
@@ -1480,9 +1541,13 @@
             <w:tcW w:type="dxa" w:w="2769"/>
           </w:tcPr>
           <w:p>
+            <w:pPr>
+              <w:spacing w:before="40" w:after="40" w:line="276" w:lineRule="auto"/>
+            </w:pPr>
             <w:r>
               <w:rPr>
                 <w:rFonts w:ascii="Times New Roman" w:hAnsi="Times New Roman"/>
+                <w:b w:val="0"/>
                 <w:sz w:val="20"/>
               </w:rPr>
               <w:t>Someone who can take charge</w:t>
@@ -1496,6 +1561,9 @@
             <w:tcW w:type="dxa" w:w="2769"/>
           </w:tcPr>
           <w:p>
+            <w:pPr>
+              <w:spacing w:before="40" w:after="40" w:line="276" w:lineRule="auto"/>
+            </w:pPr>
             <w:r>
               <w:rPr>
                 <w:rFonts w:ascii="Times New Roman" w:hAnsi="Times New Roman"/>
@@ -1511,9 +1579,13 @@
             <w:tcW w:type="dxa" w:w="2769"/>
           </w:tcPr>
           <w:p>
+            <w:pPr>
+              <w:spacing w:before="40" w:after="40" w:line="276" w:lineRule="auto"/>
+            </w:pPr>
             <w:r>
               <w:rPr>
                 <w:rFonts w:ascii="Times New Roman" w:hAnsi="Times New Roman"/>
+                <w:b w:val="0"/>
                 <w:sz w:val="20"/>
               </w:rPr>
               <w:t>Things can or will get better</w:t>
@@ -1525,9 +1597,13 @@
             <w:tcW w:type="dxa" w:w="2769"/>
           </w:tcPr>
           <w:p>
+            <w:pPr>
+              <w:spacing w:before="40" w:after="40" w:line="276" w:lineRule="auto"/>
+            </w:pPr>
             <w:r>
               <w:rPr>
                 <w:rFonts w:ascii="Times New Roman" w:hAnsi="Times New Roman"/>
+                <w:b w:val="0"/>
                 <w:sz w:val="20"/>
               </w:rPr>
               <w:t>You can or should act</w:t>
@@ -1541,6 +1617,9 @@
             <w:tcW w:type="dxa" w:w="2769"/>
           </w:tcPr>
           <w:p>
+            <w:pPr>
+              <w:spacing w:before="40" w:after="40" w:line="276" w:lineRule="auto"/>
+            </w:pPr>
             <w:r>
               <w:rPr>
                 <w:rFonts w:ascii="Times New Roman" w:hAnsi="Times New Roman"/>
@@ -1556,9 +1635,13 @@
             <w:tcW w:type="dxa" w:w="2769"/>
           </w:tcPr>
           <w:p>
+            <w:pPr>
+              <w:spacing w:before="40" w:after="40" w:line="276" w:lineRule="auto"/>
+            </w:pPr>
             <w:r>
               <w:rPr>
                 <w:rFonts w:ascii="Times New Roman" w:hAnsi="Times New Roman"/>
+                <w:b w:val="0"/>
                 <w:sz w:val="20"/>
               </w:rPr>
               <w:t>Forward-looking</w:t>
@@ -1570,9 +1653,13 @@
             <w:tcW w:type="dxa" w:w="2769"/>
           </w:tcPr>
           <w:p>
+            <w:pPr>
+              <w:spacing w:before="40" w:after="40" w:line="276" w:lineRule="auto"/>
+            </w:pPr>
             <w:r>
               <w:rPr>
                 <w:rFonts w:ascii="Times New Roman" w:hAnsi="Times New Roman"/>
+                <w:b w:val="0"/>
                 <w:sz w:val="20"/>
               </w:rPr>
               <w:t>Present-oriented agency</w:t>
@@ -1582,9 +1669,15 @@
       </w:tr>
     </w:tbl>
     <w:p>
+      <w:pPr>
+        <w:spacing w:line="480" w:lineRule="auto" w:before="0" w:after="0"/>
+        <w:ind w:firstLine="720"/>
+        <w:jc w:val="both"/>
+      </w:pPr>
       <w:r>
         <w:rPr>
           <w:rFonts w:ascii="Times New Roman" w:hAnsi="Times New Roman"/>
+          <w:b w:val="0"/>
           <w:sz w:val="22"/>
         </w:rPr>
         <w:t>Coding is guided by derivative questions rather than by an exhaustive inventory of keywords. For each caption the researcher asks: (1) What is this caption mainly trying to do for the reader's stance toward mental health. Project a positive future possibility, or position the reader as someone who can act? (2) Does the strongest grammatical force look forward (modality of possibility, temporal progression, recovery nouns) or look at the reader's capacity to act (directives, autonomy markers, boundary language)? (3) When both orientations are present, which one occupies the main clause or the final prominent position, and which speech act ("Things can or will get better" versus "You can or should act") carries the main force of the text? (4) If the two checks disagree, or if features are roughly equal and neither is prominent, or if neither orientation performs the main communicative work, the caption is coded as blended or indeterminate and logged separately. Illustrative linguistic signals for each orientation appear in Appendix A. Feature tallies are still recorded for distributional description, but each caption receives only one dominant code. This function-driven procedure is consistent with PDA's emphasis on discursive purpose over keyword frequency and is suited to short-form digital texts where meaning is densely packed within limited word counts.</w:t>
@@ -1603,14 +1696,15 @@
     </w:p>
     <w:p>
       <w:pPr>
-        <w:spacing w:line="480" w:lineRule="auto"/>
+        <w:spacing w:line="480" w:lineRule="auto" w:before="0" w:after="0"/>
         <w:ind w:firstLine="720"/>
         <w:jc w:val="both"/>
         <w:rPr/>
       </w:pPr>
       <w:r>
         <w:rPr>
-          <w:rFonts w:ascii="Georgia" w:cs="Georgia" w:eastAsia="Georgia" w:hAnsi="Georgia"/>
+          <w:rFonts w:ascii="Times New Roman" w:cs="Georgia" w:eastAsia="Georgia" w:hAnsi="Times New Roman"/>
+          <w:b w:val="0"/>
           <w:sz w:val="22"/>
           <w:szCs w:val="22"/>
           <w:rtl w:val="0"/>
@@ -1619,6 +1713,8 @@
       </w:r>
       <w:r>
         <w:rPr>
+          <w:rFonts w:ascii="Times New Roman" w:hAnsi="Times New Roman"/>
+          <w:b w:val="0"/>
           <w:sz w:val="22"/>
           <w:szCs w:val="22"/>
           <w:rtl w:val="0"/>
@@ -1627,7 +1723,8 @@
       </w:r>
       <w:r>
         <w:rPr>
-          <w:rFonts w:ascii="Georgia" w:cs="Georgia" w:eastAsia="Georgia" w:hAnsi="Georgia"/>
+          <w:rFonts w:ascii="Times New Roman" w:cs="Georgia" w:eastAsia="Georgia" w:hAnsi="Times New Roman"/>
+          <w:b w:val="0"/>
           <w:sz w:val="22"/>
           <w:szCs w:val="22"/>
           <w:rtl w:val="0"/>
@@ -1636,6 +1733,8 @@
       </w:r>
       <w:r>
         <w:rPr>
+          <w:rFonts w:ascii="Times New Roman" w:hAnsi="Times New Roman"/>
+          <w:b w:val="0"/>
           <w:sz w:val="22"/>
           <w:szCs w:val="22"/>
           <w:rtl w:val="0"/>
@@ -1644,7 +1743,8 @@
       </w:r>
       <w:r>
         <w:rPr>
-          <w:rFonts w:ascii="Georgia" w:cs="Georgia" w:eastAsia="Georgia" w:hAnsi="Georgia"/>
+          <w:rFonts w:ascii="Times New Roman" w:cs="Georgia" w:eastAsia="Georgia" w:hAnsi="Times New Roman"/>
+          <w:b w:val="0"/>
           <w:sz w:val="22"/>
           <w:szCs w:val="22"/>
           <w:rtl w:val="0"/>
@@ -1653,6 +1753,9 @@
       </w:r>
       <w:r>
         <w:rPr>
+          <w:rFonts w:ascii="Times New Roman" w:hAnsi="Times New Roman"/>
+          <w:b w:val="0"/>
+          <w:sz w:val="22"/>
           <w:rtl w:val="0"/>
         </w:rPr>
       </w:r>
@@ -3095,14 +3198,15 @@
     </w:p>
     <w:p>
       <w:pPr>
-        <w:spacing w:line="480" w:lineRule="auto"/>
-        <w:ind w:left="720" w:hanging="720"/>
-        <w:jc w:val="both"/>
-        <w:rPr/>
-      </w:pPr>
-      <w:r>
-        <w:rPr>
-          <w:rFonts w:ascii="Georgia" w:cs="Georgia" w:eastAsia="Georgia" w:hAnsi="Georgia"/>
+        <w:spacing w:line="480" w:lineRule="auto" w:before="0" w:after="0"/>
+        <w:ind w:firstLine="720"/>
+        <w:jc w:val="both"/>
+        <w:rPr/>
+      </w:pPr>
+      <w:r>
+        <w:rPr>
+          <w:rFonts w:ascii="Times New Roman" w:cs="Georgia" w:eastAsia="Georgia" w:hAnsi="Times New Roman"/>
+          <w:b w:val="0"/>
           <w:sz w:val="22"/>
           <w:szCs w:val="22"/>
           <w:rtl w:val="0"/>
@@ -3111,7 +3215,8 @@
       </w:r>
       <w:r>
         <w:rPr>
-          <w:rFonts w:ascii="Georgia" w:cs="Georgia" w:eastAsia="Georgia" w:hAnsi="Georgia"/>
+          <w:rFonts w:ascii="Times New Roman" w:cs="Georgia" w:eastAsia="Georgia" w:hAnsi="Times New Roman"/>
+          <w:b w:val="0"/>
           <w:i w:val="1"/>
           <w:iCs w:val="1"/>
           <w:sz w:val="22"/>
@@ -3122,7 +3227,8 @@
       </w:r>
       <w:r>
         <w:rPr>
-          <w:rFonts w:ascii="Georgia" w:cs="Georgia" w:eastAsia="Georgia" w:hAnsi="Georgia"/>
+          <w:rFonts w:ascii="Times New Roman" w:cs="Georgia" w:eastAsia="Georgia" w:hAnsi="Times New Roman"/>
+          <w:b w:val="0"/>
           <w:sz w:val="22"/>
           <w:szCs w:val="22"/>
           <w:rtl w:val="0"/>
@@ -3131,6 +3237,9 @@
       </w:r>
       <w:r>
         <w:rPr>
+          <w:rFonts w:ascii="Times New Roman" w:hAnsi="Times New Roman"/>
+          <w:b w:val="0"/>
+          <w:sz w:val="22"/>
           <w:rtl w:val="0"/>
         </w:rPr>
       </w:r>
@@ -3735,16 +3844,16 @@
         <w:tblStyle w:val="Table1"/>
         <w:tblW w:w="8306.0" w:type="dxa"/>
         <w:jc w:val="left"/>
-        <w:tblBorders>
-          <w:top w:color="000000" w:space="0" w:sz="4" w:val="single"/>
-          <w:left w:color="000000" w:space="0" w:sz="4" w:val="single"/>
-          <w:bottom w:color="000000" w:space="0" w:sz="4" w:val="single"/>
-          <w:right w:color="000000" w:space="0" w:sz="4" w:val="single"/>
-          <w:insideH w:color="000000" w:space="0" w:sz="4" w:val="single"/>
-          <w:insideV w:color="000000" w:space="0" w:sz="4" w:val="single"/>
-        </w:tblBorders>
         <w:tblLayout w:type="fixed"/>
         <w:tblLook w:val="0000"/>
+        <w:tblBorders>
+          <w:top w:val="single" w:sz="4" w:space="0" w:color="000000"/>
+          <w:left w:val="single" w:sz="4" w:space="0" w:color="000000"/>
+          <w:bottom w:val="single" w:sz="4" w:space="0" w:color="000000"/>
+          <w:right w:val="single" w:sz="4" w:space="0" w:color="000000"/>
+          <w:insideH w:val="single" w:sz="4" w:space="0" w:color="000000"/>
+          <w:insideV w:val="single" w:sz="4" w:space="0" w:color="000000"/>
+        </w:tblBorders>
       </w:tblPr>
       <w:tblGrid>
         <w:gridCol w:w="1661"/>
@@ -3948,23 +4057,15 @@
           </w:tcPr>
           <w:p>
             <w:pPr>
-              <w:spacing w:after="0" w:before="0" w:lineRule="auto"/>
-              <w:jc w:val="left"/>
-              <w:rPr/>
+              <w:spacing w:before="40" w:after="40" w:line="276" w:lineRule="auto"/>
             </w:pPr>
             <w:r>
               <w:rPr>
-                <w:rFonts w:ascii="Georgia" w:cs="Georgia" w:eastAsia="Georgia" w:hAnsi="Georgia"/>
+                <w:rFonts w:ascii="Times New Roman" w:hAnsi="Times New Roman"/>
+                <w:b w:val="0"/>
                 <w:sz w:val="18"/>
-                <w:szCs w:val="18"/>
-                <w:rtl w:val="0"/>
               </w:rPr>
-              <w:t xml:space="preserve">Modality: can, will, may, couldTemporal: soon, eventually, step by stepRecovery nouns: healing, growth, recoveryAdverbs: possibly, hopefullyConditionals: if you keep going...</w:t>
-            </w:r>
-            <w:r>
-              <w:rPr>
-                <w:rtl w:val="0"/>
-              </w:rPr>
+              <w:t>Modality: can, will, may, could. Temporal: soon, eventually, step by step. Recovery nouns: healing, growth, recovery. Adverbs: possibly, hopefully. Conditionals: if you keep going...</w:t>
             </w:r>
           </w:p>
         </w:tc>
@@ -4056,23 +4157,15 @@
           </w:tcPr>
           <w:p>
             <w:pPr>
-              <w:spacing w:after="0" w:before="0" w:lineRule="auto"/>
-              <w:jc w:val="left"/>
-              <w:rPr/>
+              <w:spacing w:before="40" w:after="40" w:line="276" w:lineRule="auto"/>
             </w:pPr>
             <w:r>
               <w:rPr>
-                <w:rFonts w:ascii="Georgia" w:cs="Georgia" w:eastAsia="Georgia" w:hAnsi="Georgia"/>
+                <w:rFonts w:ascii="Times New Roman" w:hAnsi="Times New Roman"/>
+                <w:b w:val="0"/>
                 <w:sz w:val="18"/>
-                <w:szCs w:val="18"/>
-                <w:rtl w:val="0"/>
               </w:rPr>
-              <w:t xml:space="preserve">Directives: seek, set, prioritize, takeSelf-care: boundaries, rest, check inAgency: you can decide, trust yourselfAutonomy: at your own pace, when readyAction phrases: small wins, your journey</w:t>
-            </w:r>
-            <w:r>
-              <w:rPr>
-                <w:rtl w:val="0"/>
-              </w:rPr>
+              <w:t>Directives: seek, set, prioritize, take. Self-care: boundaries, rest, check in. Agency: you can decide, trust yourself. Autonomy: at your own pace, when ready. Action phrases: small wins, your journey</w:t>
             </w:r>
           </w:p>
         </w:tc>
@@ -4197,16 +4290,16 @@
         <w:tblStyle w:val="Table2"/>
         <w:tblW w:w="8306.0" w:type="dxa"/>
         <w:jc w:val="left"/>
-        <w:tblBorders>
-          <w:top w:color="000000" w:space="0" w:sz="4" w:val="single"/>
-          <w:left w:color="000000" w:space="0" w:sz="4" w:val="single"/>
-          <w:bottom w:color="000000" w:space="0" w:sz="4" w:val="single"/>
-          <w:right w:color="000000" w:space="0" w:sz="4" w:val="single"/>
-          <w:insideH w:color="000000" w:space="0" w:sz="4" w:val="single"/>
-          <w:insideV w:color="000000" w:space="0" w:sz="4" w:val="single"/>
-        </w:tblBorders>
         <w:tblLayout w:type="fixed"/>
         <w:tblLook w:val="0000"/>
+        <w:tblBorders>
+          <w:top w:val="single" w:sz="4" w:space="0" w:color="000000"/>
+          <w:left w:val="single" w:sz="4" w:space="0" w:color="000000"/>
+          <w:bottom w:val="single" w:sz="4" w:space="0" w:color="000000"/>
+          <w:right w:val="single" w:sz="4" w:space="0" w:color="000000"/>
+          <w:insideH w:val="single" w:sz="4" w:space="0" w:color="000000"/>
+          <w:insideV w:val="single" w:sz="4" w:space="0" w:color="000000"/>
+        </w:tblBorders>
       </w:tblPr>
       <w:tblGrid>
         <w:gridCol w:w="1963"/>
@@ -4530,23 +4623,15 @@
           </w:tcPr>
           <w:p>
             <w:pPr>
-              <w:spacing w:after="0" w:before="0" w:lineRule="auto"/>
-              <w:jc w:val="left"/>
-              <w:rPr/>
+              <w:spacing w:before="40" w:after="40" w:line="276" w:lineRule="auto"/>
             </w:pPr>
             <w:r>
               <w:rPr>
-                <w:rFonts w:ascii="Georgia" w:cs="Georgia" w:eastAsia="Georgia" w:hAnsi="Georgia"/>
+                <w:rFonts w:ascii="Times New Roman" w:hAnsi="Times New Roman"/>
+                <w:b w:val="0"/>
                 <w:sz w:val="18"/>
-                <w:szCs w:val="18"/>
-                <w:rtl w:val="0"/>
               </w:rPr>
-              <w:t xml:space="preserve">First-person: I felt, I went through, I struggledTemporal: last year, during my..., when I was...Disclosure: it helped me, my journey...Connection: this resonates, I relate, same here</w:t>
-            </w:r>
-            <w:r>
-              <w:rPr>
-                <w:rtl w:val="0"/>
-              </w:rPr>
+              <w:t>First-person: I felt, I went through, I struggled. Temporal: last year, during my..., when I was... Disclosure: it helped me, my journey... Connection: this resonates, I relate, same here</w:t>
             </w:r>
           </w:p>
         </w:tc>

</xml_diff>